<commit_message>
feat(web_app): redesign login UI with UI/UX Pro Max, update project docs and Docker production
</commit_message>
<xml_diff>
--- a/templates/iemm-bien-ban-template.docx
+++ b/templates/iemm-bien-ban-template.docx
@@ -1,12 +1,12 @@
 
 <file path=word/document.xml><?xml version="1.0" encoding="utf-8"?>
-<w:document xmlns:wpc="http://schemas.microsoft.com/office/word/2010/wordprocessingCanvas" xmlns:cx="http://schemas.microsoft.com/office/drawing/2014/chartex" xmlns:cx1="http://schemas.microsoft.com/office/drawing/2015/9/8/chartex" xmlns:cx2="http://schemas.microsoft.com/office/drawing/2015/10/21/chartex" xmlns:cx3="http://schemas.microsoft.com/office/drawing/2016/5/9/chartex" xmlns:cx4="http://schemas.microsoft.com/office/drawing/2016/5/10/chartex" xmlns:cx5="http://schemas.microsoft.com/office/drawing/2016/5/11/chartex" xmlns:cx6="http://schemas.microsoft.com/office/drawing/2016/5/12/chartex" xmlns:cx7="http://schemas.microsoft.com/office/drawing/2016/5/13/chartex" xmlns:cx8="http://schemas.microsoft.com/office/drawing/2016/5/14/chartex" xmlns:mc="http://schemas.openxmlformats.org/markup-compatibility/2006" xmlns:aink="http://schemas.microsoft.com/office/drawing/2016/ink" xmlns:am3d="http://schemas.microsoft.com/office/drawing/2017/model3d" xmlns:o="urn:schemas-microsoft-com:office:office" xmlns:r="http://schemas.openxmlformats.org/officeDocument/2006/relationships" xmlns:m="http://schemas.openxmlformats.org/officeDocument/2006/math" xmlns:v="urn:schemas-microsoft-com:vml" xmlns:wp14="http://schemas.microsoft.com/office/word/2010/wordprocessingDrawing" xmlns:wp="http://schemas.openxmlformats.org/drawingml/2006/wordprocessingDrawing" xmlns:w10="urn:schemas-microsoft-com:office:word" xmlns:w="http://schemas.openxmlformats.org/wordprocessingml/2006/main" xmlns:w14="http://schemas.microsoft.com/office/word/2010/wordml" xmlns:w15="http://schemas.microsoft.com/office/word/2012/wordml" xmlns:w16cex="http://schemas.microsoft.com/office/word/2018/wordml/cex" xmlns:w16cid="http://schemas.microsoft.com/office/word/2016/wordml/cid" xmlns:w16="http://schemas.microsoft.com/office/word/2018/wordml" xmlns:w16sdtdh="http://schemas.microsoft.com/office/word/2020/wordml/sdtdatahash" xmlns:w16se="http://schemas.microsoft.com/office/word/2015/wordml/symex" xmlns:wpg="http://schemas.microsoft.com/office/word/2010/wordprocessingGroup" xmlns:wpi="http://schemas.microsoft.com/office/word/2010/wordprocessingInk" xmlns:wne="http://schemas.microsoft.com/office/word/2006/wordml" xmlns:wps="http://schemas.microsoft.com/office/word/2010/wordprocessingShape" xmlns:a="http://schemas.openxmlformats.org/drawingml/2006/main" mc:Ignorable="w14 w15 w16se w16cid w16 w16cex w16sdtdh wp14">
+<w:document xmlns:a="http://schemas.openxmlformats.org/drawingml/2006/main" xmlns:mc="http://schemas.openxmlformats.org/markup-compatibility/2006" xmlns:ns5="urn:schemas-microsoft-com:vml" xmlns:ns6="urn:schemas-microsoft-com:office:word" xmlns:ns7="http://schemas.microsoft.com/office/word/2010/wordml" xmlns:r="http://schemas.openxmlformats.org/officeDocument/2006/relationships" xmlns:w="http://schemas.openxmlformats.org/wordprocessingml/2006/main" xmlns:wp="http://schemas.openxmlformats.org/drawingml/2006/wordprocessingDrawing" xmlns:wps="http://schemas.microsoft.com/office/word/2010/wordprocessingShape" mc:Ignorable="w14 w15 w16se w16cid w16 w16cex w16sdtdh wp14">
   <w:body>
     <w:tbl>
       <w:tblPr>
-        <w:tblW w:w="9921" w:type="dxa"/>
+        <w:tblW w:w="10204" w:type="dxa"/>
         <w:jc w:val="left"/>
-        <w:tblInd w:w="-283" w:type="dxa"/>
+        <w:tblInd w:w="0" w:type="dxa"/>
         <w:tblLayout w:type="fixed"/>
         <w:tblCellMar>
           <w:top w:w="0" w:type="dxa"/>
@@ -15,10 +15,10 @@
           <w:right w:w="0" w:type="dxa"/>
         </w:tblCellMar>
         <w:tblLook w:val="04A0" w:firstRow="1" w:lastRow="0" w:firstColumn="1" w:lastColumn="0" w:noHBand="0" w:noVBand="1"/>
-        <w:tblDescription w:val="TVCI_HEADER_STANDARDIZED"/>
+        <w:tblDescription w:val="TVCI_HEADER_EXT_R5"/>
       </w:tblPr>
       <w:tblGrid>
-        <w:gridCol w:w="4550"/>
+        <w:gridCol w:w="4833"/>
         <w:gridCol w:w="5371"/>
       </w:tblGrid>
       <w:tr>
@@ -27,7 +27,7 @@
         </w:trPr>
         <w:tc>
           <w:tcPr>
-            <w:tcW w:w="4550" w:type="dxa"/>
+            <w:tcW w:w="4833" w:type="dxa"/>
             <w:tcMar>
               <w:top w:w="0" w:type="dxa"/>
               <w:left w:w="0" w:type="dxa"/>
@@ -119,13 +119,13 @@
                 </mc:Choice>
                 <mc:Fallback>
                   <w:pict>
-                    <v:line id="Agency rule" style="position:absolute;z-index:251658240;visibility:visible" from="0,0" to="79.5pt,0" strokecolor="#000000" strokeweight="0.75pt">
-                      <w10:wrap type="none"/>
-                    </v:line>
+                    <ns5:line id="Agency rule" style="position:absolute;z-index:251658240;visibility:visible" from="0,0" to="79.5pt,0" strokecolor="#000000" strokeweight="0.75pt">
+                      <ns6:wrap type="none"/>
+                    </ns5:line>
                   </w:pict>
-                  <v:line id="Agency rule_fb" style="position:absolute;z-index:251658240;visibility:visible" from="0,0" to="79.5pt,0" strokecolor="#000000" strokeweight="0.75pt">
-                    <w10:wrap type="none"/>
-                  </v:line>
+                  <ns5:line id="Agency rule_fb" style="position:absolute;z-index:251658240;visibility:visible" from="0,0" to="79.5pt,0" strokecolor="#000000" strokeweight="0.75pt">
+                    <ns6:wrap type="none"/>
+                  </ns5:line>
                 </mc:Fallback>
               </mc:AlternateContent>
             </w:r>
@@ -164,8 +164,8 @@
           </w:tcPr>
           <w:p>
             <w:pPr>
+              <w:spacing w:before="0" w:after="0" w:line="240" w:lineRule="auto"/>
               <w:jc w:val="center"/>
-              <w:spacing w:before="0" w:after="0" w:line="240" w:lineRule="auto"/>
             </w:pPr>
             <w:r>
               <w:rPr>
@@ -179,8 +179,8 @@
           </w:p>
           <w:p>
             <w:pPr>
+              <w:spacing w:before="0" w:after="0" w:line="240" w:lineRule="auto"/>
               <w:jc w:val="center"/>
-              <w:spacing w:before="0" w:after="0" w:line="240" w:lineRule="auto"/>
             </w:pPr>
             <w:r>
               <w:rPr>
@@ -195,6 +195,8 @@
               <w:rPr>
                 <w:rFonts w:ascii="Times New Roman" w:hAnsi="Times New Roman" w:cs="Times New Roman" w:eastAsia="Times New Roman"/>
                 <w:noProof/>
+                <w:sz w:val="26"/>
+                <w:b/>
               </w:rPr>
               <mc:AlternateContent>
                 <mc:Choice Requires="wps">
@@ -239,13 +241,13 @@
                 </mc:Choice>
                 <mc:Fallback>
                   <w:pict>
-                    <v:line id="Motto rule" style="position:absolute;z-index:251658240;visibility:visible" from="0,0" to="160.5pt,0" strokecolor="#000000" strokeweight="0.75pt">
-                      <w10:wrap type="none"/>
-                    </v:line>
+                    <ns5:line id="Motto rule" style="position:absolute;z-index:251658240;visibility:visible" from="0,0" to="160.5pt,0" strokecolor="#000000" strokeweight="0.75pt">
+                      <ns6:wrap type="none"/>
+                    </ns5:line>
                   </w:pict>
-                  <v:line id="Motto rule_fb" style="position:absolute;z-index:251658240;visibility:visible" from="0,0" to="160.5pt,0" strokecolor="#000000" strokeweight="0.75pt">
-                    <w10:wrap type="none"/>
-                  </v:line>
+                  <ns5:line id="Motto rule_fb" style="position:absolute;z-index:251658240;visibility:visible" from="0,0" to="160.5pt,0" strokecolor="#000000" strokeweight="0.75pt">
+                    <ns6:wrap type="none"/>
+                  </ns5:line>
                 </mc:Fallback>
               </mc:AlternateContent>
             </w:r>
@@ -276,12 +278,12 @@
         </w:tc>
       </w:tr>
     </w:tbl>
-    <w:p>
+    <w:p ns7:paraId="2D0F0955" ns7:textId="77777777">
       <w:pPr>
         <w:spacing w:after="200"/>
       </w:pPr>
     </w:p>
-    <w:p>
+    <w:p ns7:paraId="34E5C2D8" ns7:textId="77777777">
       <w:pPr>
         <w:spacing w:after="40"/>
         <w:jc w:val="center"/>
@@ -295,9 +297,9 @@
         <w:t>BIÊN BẢN</w:t>
       </w:r>
     </w:p>
-    <w:p>
+    <w:p ns7:paraId="6D709E73" ns7:textId="77777777">
       <w:pPr>
-        <w:spacing w:before="40" w:after="120" w:line="360" w:lineRule="exact"/>
+        <w:spacing w:before="0" w:after="120" w:line="360" w:lineRule="auto"/>
         <w:ind w:firstLine="567"/>
         <w:jc w:val="both"/>
       </w:pPr>
@@ -309,9 +311,9 @@
         <w:t>[Nội dung cuộc họp/bàn giao/làm việc]</w:t>
       </w:r>
     </w:p>
-    <w:p>
+    <w:p ns7:paraId="147B94A5" ns7:textId="77777777">
       <w:pPr>
-        <w:spacing w:before="40" w:after="120" w:line="360" w:lineRule="exact"/>
+        <w:spacing w:before="0" w:after="120" w:line="360" w:lineRule="auto"/>
         <w:ind w:firstLine="567"/>
         <w:jc w:val="both"/>
       </w:pPr>
@@ -338,9 +340,9 @@
         </w:sdtContent>
       </w:sdt>
     </w:p>
-    <w:p>
+    <w:p ns7:paraId="640242F3" ns7:textId="77777777">
       <w:pPr>
-        <w:spacing w:before="40" w:after="120" w:line="360" w:lineRule="exact"/>
+        <w:spacing w:before="0" w:after="120" w:line="360" w:lineRule="auto"/>
         <w:ind w:firstLine="567"/>
         <w:jc w:val="both"/>
       </w:pPr>
@@ -367,9 +369,9 @@
         </w:sdtContent>
       </w:sdt>
     </w:p>
-    <w:p>
+    <w:p ns7:paraId="45CF4948" ns7:textId="77777777">
       <w:pPr>
-        <w:spacing w:before="40" w:after="120" w:line="360" w:lineRule="exact"/>
+        <w:spacing w:before="0" w:after="120" w:line="360" w:lineRule="auto"/>
         <w:ind w:firstLine="567"/>
         <w:jc w:val="both"/>
       </w:pPr>
@@ -396,7 +398,7 @@
         </w:sdtContent>
       </w:sdt>
     </w:p>
-    <w:p>
+    <w:p ns7:paraId="3C3B234D" ns7:textId="77777777">
       <w:pPr>
         <w:spacing w:before="100" w:after="80"/>
       </w:pPr>
@@ -408,7 +410,7 @@
         <w:t>NỘI DUNG VÀ KẾT QUẢ</w:t>
       </w:r>
     </w:p>
-    <w:p>
+    <w:p ns7:paraId="43C61A23" ns7:textId="77777777">
       <w:pPr>
         <w:ind w:firstLine="567"/>
       </w:pPr>
@@ -426,78 +428,31 @@
         </w:sdtContent>
       </w:sdt>
     </w:p>
-    <w:p>
-      <w:pPr>
-        <w:spacing w:before="40" w:after="120" w:line="360" w:lineRule="exact"/>
-        <w:ind w:firstLine="567"/>
-        <w:jc w:val="both"/>
-      </w:pPr>
-      <w:sdt>
-        <w:sdtPr>
-          <w:tag w:val="KET_LUAN"/>
-        </w:sdtPr>
-        <w:sdtContent>
-          <w:r>
-            <w:rPr>
-              <w:rFonts w:cs="Times New Roman" w:ascii="Times New Roman" w:hAnsi="Times New Roman"/>
-              <w:sz w:val="26"/>
-            </w:rPr>
-            <w:t>[Tiếp tục nội dung, căn cứ, thời hạn hoặc trách nhiệm thực hiện]</w:t>
-          </w:r>
-        </w:sdtContent>
-      </w:sdt>
-    </w:p>
-    <w:p>
-      <w:pPr>
-        <w:spacing w:before="40" w:after="120" w:line="360" w:lineRule="exact"/>
-        <w:ind w:firstLine="567"/>
-        <w:jc w:val="both"/>
-      </w:pPr>
-      <w:r>
-        <w:rPr>
-          <w:rFonts w:cs="Times New Roman" w:ascii="Times New Roman" w:hAnsi="Times New Roman"/>
-          <w:sz w:val="26"/>
-        </w:rPr>
-        <w:t>[Tiếp tục nội dung, căn cứ, thời hạn hoặc trách nhiệm thực hiện]</w:t>
-      </w:r>
-    </w:p>
-    <w:p>
-      <w:pPr>
-        <w:spacing w:before="40" w:after="120" w:line="360" w:lineRule="exact"/>
-        <w:ind w:firstLine="567"/>
-        <w:jc w:val="both"/>
-      </w:pPr>
-      <w:r>
-        <w:rPr>
-          <w:rFonts w:cs="Times New Roman" w:ascii="Times New Roman" w:hAnsi="Times New Roman"/>
-          <w:sz w:val="26"/>
-        </w:rPr>
-        <w:t>[Tiếp tục nội dung, căn cứ, thời hạn hoặc trách nhiệm thực hiện]</w:t>
-      </w:r>
-    </w:p>
-    <w:p>
+    <w:p ns7:paraId="30325044" ns7:textId="77777777">
       <w:pPr>
         <w:spacing w:after="200"/>
       </w:pPr>
     </w:p>
     <w:tbl>
       <w:tblPr>
-        <w:tblW w:w="0" w:type="auto"/>
-        <w:jc w:val="center"/>
+        <w:tblW w:w="9355" w:type="dxa"/>
+        <w:jc w:val="left"/>
         <w:tblLayout w:type="fixed"/>
         <w:tblLook w:val="04A0" w:firstRow="1" w:lastRow="0" w:firstColumn="1" w:lastColumn="0" w:noHBand="0" w:noVBand="1"/>
+        <w:tblInd w:w="141" w:type="dxa"/>
+        <w:tblDescription w:val="TVCI_HEADER_EXT_R5"/>
       </w:tblPr>
       <w:tblGrid>
-        <w:gridCol w:w="4536"/>
+        <w:gridCol w:w="4819"/>
         <w:gridCol w:w="4536"/>
       </w:tblGrid>
-      <w:tr>
+      <w:tr ns7:paraId="7E60FEDD" ns7:textId="77777777">
         <w:trPr>
           <w:jc w:val="center"/>
         </w:trPr>
         <w:tc>
           <w:tcPr>
-            <w:tcW w:w="4536" w:type="dxa"/>
+            <w:tcW w:w="4819" w:type="dxa"/>
             <w:tcBorders>
               <w:top w:val="nil"/>
               <w:left w:val="nil"/>
@@ -505,8 +460,8 @@
               <w:right w:val="nil"/>
             </w:tcBorders>
           </w:tcPr>
-          <w:p/>
-          <w:p>
+          <w:p ns7:paraId="153E0D48" ns7:textId="77777777"/>
+          <w:p ns7:paraId="08904F10" ns7:textId="77777777">
             <w:pPr>
               <w:spacing w:before="0" w:after="0" w:line="240" w:lineRule="auto"/>
               <w:jc w:val="left"/>
@@ -573,8 +528,8 @@
               <w:right w:val="nil"/>
             </w:tcBorders>
           </w:tcPr>
-          <w:p/>
-          <w:p>
+          <w:p ns7:paraId="2335CC5E" ns7:textId="77777777"/>
+          <w:p ns7:paraId="61EDE46C" ns7:textId="77777777">
             <w:pPr>
               <w:spacing w:after="0"/>
               <w:jc w:val="center"/>
@@ -635,7 +590,7 @@
         </w:tc>
       </w:tr>
     </w:tbl>
-    <w:p>
+    <w:p ns7:paraId="6A1E593F" ns7:textId="77777777">
       <w:sdt>
         <w:sdtPr>
           <w:tag w:val="THU_KY"/>

</xml_diff>